<commit_message>
Fillimi i raportit te dyt
</commit_message>
<xml_diff>
--- a/Raporti_Teknik_1_Sistemi_Menaxhimi_Pikave_Shitjes (1).docx
+++ b/Raporti_Teknik_1_Sistemi_Menaxhimi_Pikave_Shitjes (1).docx
@@ -1127,8 +1127,6 @@
             <w:r>
               <w:t xml:space="preserve"> XAMPP.</w:t>
             </w:r>
-            <w:bookmarkStart w:id="0" w:name="_GoBack"/>
-            <w:bookmarkEnd w:id="0"/>
           </w:p>
         </w:tc>
       </w:tr>
@@ -2123,9 +2121,225 @@
     </w:p>
     <w:p>
       <w:r>
-        <w:t>Në këtë raport është përcaktuar baza e projektit për Sistemin për Menaxhimin e Pikave të Shitjes. Janë identifikuar përdoruesit, problemi që zgjidh sistemi, funksionalitetet kryesore, kërkesat funksionale dhe jofunksionale, teknologjitë e propozuara, arkitektura dhe modeli fillestar i databazës. Ky dizajn do të shërbejë si bazë për implementimin gradual të aplikacionit gjatë semestrit.</w:t>
+        <w:t xml:space="preserve">Në këtë raport është përcaktuar baza e projektit për Sistemin për Menaxhimin e Pikave të Shitjes. Janë identifikuar përdoruesit, problemi që zgjidh sistemi, funksionalitetet kryesore, kërkesat funksionale dhe jofunksionale, teknologjitë e propozuara, arkitektura dhe modeli fillestar i databazës. </w:t>
+      </w:r>
+      <w:proofErr w:type="gramStart"/>
+      <w:r>
+        <w:t>Ky</w:t>
+      </w:r>
+      <w:proofErr w:type="gramEnd"/>
+      <w:r>
+        <w:t xml:space="preserve"> dizajn do të shërbejë si bazë për implementimin gradual </w:t>
+      </w:r>
+      <w:proofErr w:type="spellStart"/>
+      <w:r>
+        <w:t>të</w:t>
+      </w:r>
+      <w:proofErr w:type="spellEnd"/>
+      <w:r>
+        <w:t xml:space="preserve"> </w:t>
+      </w:r>
+      <w:proofErr w:type="spellStart"/>
+      <w:r>
+        <w:t>aplikacionit</w:t>
+      </w:r>
+      <w:proofErr w:type="spellEnd"/>
+      <w:r>
+        <w:t xml:space="preserve"> </w:t>
+      </w:r>
+      <w:proofErr w:type="spellStart"/>
+      <w:r>
+        <w:t>gjatë</w:t>
+      </w:r>
+      <w:proofErr w:type="spellEnd"/>
+      <w:r>
+        <w:t xml:space="preserve"> </w:t>
+      </w:r>
+      <w:proofErr w:type="spellStart"/>
+      <w:r>
+        <w:t>semestrit</w:t>
+      </w:r>
+      <w:proofErr w:type="spellEnd"/>
+      <w:r>
+        <w:t>.</w:t>
       </w:r>
     </w:p>
+    <w:p/>
+    <w:p/>
+    <w:p/>
+    <w:p/>
+    <w:p/>
+    <w:p/>
+    <w:p/>
+    <w:p/>
+    <w:p/>
+    <w:p/>
+    <w:p/>
+    <w:p/>
+    <w:p/>
+    <w:p/>
+    <w:p/>
+    <w:p/>
+    <w:p/>
+    <w:p/>
+    <w:p/>
+    <w:p/>
+    <w:p/>
+    <w:p/>
+    <w:p>
+      <w:pPr>
+        <w:jc w:val="center"/>
+        <w:rPr>
+          <w:b/>
+          <w:sz w:val="32"/>
+          <w:szCs w:val="32"/>
+        </w:rPr>
+      </w:pPr>
+      <w:proofErr w:type="spellStart"/>
+      <w:r>
+        <w:rPr>
+          <w:b/>
+          <w:sz w:val="32"/>
+          <w:szCs w:val="32"/>
+        </w:rPr>
+        <w:lastRenderedPageBreak/>
+        <w:t>Raporti</w:t>
+      </w:r>
+      <w:proofErr w:type="spellEnd"/>
+      <w:r>
+        <w:rPr>
+          <w:b/>
+          <w:sz w:val="32"/>
+          <w:szCs w:val="32"/>
+        </w:rPr>
+        <w:t xml:space="preserve"> </w:t>
+      </w:r>
+      <w:proofErr w:type="spellStart"/>
+      <w:r>
+        <w:rPr>
+          <w:b/>
+          <w:sz w:val="32"/>
+          <w:szCs w:val="32"/>
+        </w:rPr>
+        <w:t>Teknik</w:t>
+      </w:r>
+      <w:proofErr w:type="spellEnd"/>
+      <w:r>
+        <w:rPr>
+          <w:b/>
+          <w:sz w:val="32"/>
+          <w:szCs w:val="32"/>
+        </w:rPr>
+        <w:t xml:space="preserve"> 1</w:t>
+      </w:r>
+    </w:p>
+    <w:p>
+      <w:pPr>
+        <w:jc w:val="center"/>
+        <w:rPr>
+          <w:b/>
+          <w:sz w:val="28"/>
+          <w:szCs w:val="28"/>
+        </w:rPr>
+      </w:pPr>
+      <w:proofErr w:type="spellStart"/>
+      <w:r>
+        <w:rPr>
+          <w:b/>
+          <w:sz w:val="28"/>
+          <w:szCs w:val="28"/>
+        </w:rPr>
+        <w:t>Analiza</w:t>
+      </w:r>
+      <w:proofErr w:type="spellEnd"/>
+      <w:r>
+        <w:rPr>
+          <w:b/>
+          <w:sz w:val="28"/>
+          <w:szCs w:val="28"/>
+        </w:rPr>
+        <w:t xml:space="preserve">, </w:t>
+      </w:r>
+      <w:proofErr w:type="spellStart"/>
+      <w:r>
+        <w:rPr>
+          <w:b/>
+          <w:sz w:val="28"/>
+          <w:szCs w:val="28"/>
+        </w:rPr>
+        <w:t>Kërkesat</w:t>
+      </w:r>
+      <w:proofErr w:type="spellEnd"/>
+      <w:r>
+        <w:rPr>
+          <w:b/>
+          <w:sz w:val="28"/>
+          <w:szCs w:val="28"/>
+        </w:rPr>
+        <w:t xml:space="preserve"> </w:t>
+      </w:r>
+      <w:proofErr w:type="spellStart"/>
+      <w:r>
+        <w:rPr>
+          <w:b/>
+          <w:sz w:val="28"/>
+          <w:szCs w:val="28"/>
+        </w:rPr>
+        <w:t>dhe</w:t>
+      </w:r>
+      <w:proofErr w:type="spellEnd"/>
+      <w:r>
+        <w:rPr>
+          <w:b/>
+          <w:sz w:val="28"/>
+          <w:szCs w:val="28"/>
+        </w:rPr>
+        <w:t xml:space="preserve"> </w:t>
+      </w:r>
+      <w:proofErr w:type="spellStart"/>
+      <w:r>
+        <w:rPr>
+          <w:b/>
+          <w:sz w:val="28"/>
+          <w:szCs w:val="28"/>
+        </w:rPr>
+        <w:t>Dizajni</w:t>
+      </w:r>
+      <w:proofErr w:type="spellEnd"/>
+      <w:r>
+        <w:rPr>
+          <w:b/>
+          <w:sz w:val="28"/>
+          <w:szCs w:val="28"/>
+        </w:rPr>
+        <w:t xml:space="preserve"> </w:t>
+      </w:r>
+      <w:proofErr w:type="spellStart"/>
+      <w:r>
+        <w:rPr>
+          <w:b/>
+          <w:sz w:val="28"/>
+          <w:szCs w:val="28"/>
+        </w:rPr>
+        <w:t>Teknik</w:t>
+      </w:r>
+      <w:proofErr w:type="spellEnd"/>
+    </w:p>
+    <w:p/>
+    <w:p/>
+    <w:p/>
+    <w:p/>
+    <w:p/>
+    <w:p>
+      <w:bookmarkStart w:id="0" w:name="_GoBack"/>
+      <w:bookmarkEnd w:id="0"/>
+    </w:p>
+    <w:p/>
+    <w:p/>
+    <w:p/>
+    <w:p/>
+    <w:p/>
+    <w:p/>
     <w:sectPr>
       <w:footerReference w:type="default" r:id="rId8"/>
       <w:pgSz w:w="12240" w:h="15840"/>
@@ -14806,7 +15020,7 @@
 </file>
 
 <file path=customXml/itemProps1.xml><?xml version="1.0" encoding="utf-8"?>
-<ds:datastoreItem xmlns:ds="http://schemas.openxmlformats.org/officeDocument/2006/customXml" ds:itemID="{69292298-A6F2-47FD-8FB3-B1660ECD6174}">
+<ds:datastoreItem xmlns:ds="http://schemas.openxmlformats.org/officeDocument/2006/customXml" ds:itemID="{07E07338-AB30-4636-AB92-A562B5A5D7A8}">
   <ds:schemaRefs>
     <ds:schemaRef ds:uri="http://schemas.openxmlformats.org/officeDocument/2006/bibliography"/>
   </ds:schemaRefs>

</xml_diff>